<commit_message>
docs: add chapter 2
</commit_message>
<xml_diff>
--- a/reports/bao_cao.docx
+++ b/reports/bao_cao.docx
@@ -544,92 +544,47 @@
         <w:jc w:val="both"/>
       </w:pPr>
       <w:r>
-        <w:t xml:space="preserve">Trong bối cảnh chuyển đổi số và sự phát triển mạnh mẽ của công nghệ thông tin, dữ liệu đã trở thành một trong những nguồn tài nguyên quan trọng đối với các tổ chức tài chính và ngân hàng. Sự gia tăng nhanh chóng của dữ liệu khách hàng, giao dịch tài chính và hoạt động tín dụng đã thúc đẩy nhu cầu ứng dụng các kỹ thuật phân tích dữ liệu nhằm khai thác thông tin có giá trị phục vụ cho quá trình ra quyết định. Trong lĩnh vực tài chính, </w:t>
-      </w:r>
-      <w:r>
-        <w:t>phân tích dữ liệu</w:t>
-      </w:r>
-      <w:r>
-        <w:t xml:space="preserve"> được xem là một công cụ quan trọng giúp các tổ chức tài chính nâng cao hiệu quả vận hành, tối ưu hóa dịch vụ và giảm thiểu rủi ro trong hoạt động kinh doanh.</w:t>
-      </w:r>
-    </w:p>
-    <w:p>
-      <w:pPr>
-        <w:jc w:val="both"/>
-      </w:pPr>
-      <w:r>
-        <w:t>Phân tích dữ liệu</w:t>
-      </w:r>
-      <w:r>
-        <w:t xml:space="preserve"> là quá trình thu thập, xử lý, phân tích và trực quan hóa dữ liệu nhằm khám phá thông tin, xu hướng và tri thức tiềm ẩn từ dữ liệu. Quá trình này thường kết hợp giữa các phương pháp thống kê, khai phá dữ liệu và học máy để hỗ trợ phân tích và dự đoán. Trong môi trường tài chính hiện đại, dữ liệu không chỉ được sử dụng để lưu trữ thông tin giao dịch mà còn đóng vai trò quan trọng trong việc phân tích hành vi khách hàng, đánh giá khả năng tín dụng và dự báo rủi ro tài chính. Nhờ khả năng xử lý khối lượng dữ liệu lớn với tốc độ cao, </w:t>
-      </w:r>
-      <w:r>
-        <w:t>phân tích dữ liệu</w:t>
-      </w:r>
-      <w:r>
-        <w:t xml:space="preserve"> giúp các tổ chức tài chính nâng cao độ chính xác trong việc ra quyết định và cải thiện trải nghiệm khách hàng.</w:t>
-      </w:r>
-    </w:p>
-    <w:p>
-      <w:pPr>
-        <w:jc w:val="both"/>
-      </w:pPr>
-      <w:r>
-        <w:t xml:space="preserve">Trong lĩnh vực ngân hàng, </w:t>
-      </w:r>
-      <w:r>
-        <w:t>phân tích dữ liệu</w:t>
-      </w:r>
-      <w:r>
-        <w:t xml:space="preserve"> được ứng dụng rộng rãi trong nhiều hoạt động khác nhau như quản lý khách hàng, dự báo tài chính, quản trị rủi ro và hỗ trợ xét duyệt tín dụng. Một trong những ứng dụng quan trọng nhất là hệ thống chấm điểm tín dụng, trong đó dữ liệu khách hàng được phân tích để đánh giá khả năng thanh toán và mức độ uy tín tín dụng của người vay. Các yếu tố như thu nhập, lịch sử tín dụng, giá trị tài sản và thời hạn vay thường được sử dụng làm cơ sở để xây dựng mô hình dự đoán khả năng phê duyệt khoản vay. Việc áp dụng phân tích dữ liệu trong chấm điểm tín dụng giúp ngân hàng giảm thiểu sự phụ thuộc vào đánh giá chủ quan của chuyên viên tín dụng, đồng thời nâng cao tính khách quan và hiệu quả trong quá trình xét duyệt khoản vay.</w:t>
-      </w:r>
-    </w:p>
-    <w:p>
-      <w:pPr>
-        <w:jc w:val="both"/>
-      </w:pPr>
-      <w:r>
-        <w:t xml:space="preserve">Bên cạnh đó, </w:t>
-      </w:r>
-      <w:r>
-        <w:t>phân tích dữ liệu</w:t>
-      </w:r>
-      <w:r>
-        <w:t xml:space="preserve"> còn đóng vai trò quan trọng trong hoạt động phân tích rủi ro</w:t>
-      </w:r>
-      <w:r>
-        <w:t xml:space="preserve"> </w:t>
-      </w:r>
-      <w:r>
-        <w:t>của ngân hàng. Thông qua việc khai thác dữ liệu lịch sử và mô hình hóa hành vi khách hàng, các tổ chức tài chính có thể nhận diện sớm các khoản vay có nguy cơ mất khả năng thanh toán, từ đó đưa ra các biện pháp kiểm soát phù hợp. Việc ứng dụng các kỹ thuật phân tích dữ liệu giúp ngân hàng tối ưu hóa chiến lược quản trị rủi ro, nâng cao khả năng dự báo và giảm thiểu tổn thất tài chính trong hoạt động tín dụng.</w:t>
-      </w:r>
-    </w:p>
-    <w:p>
-      <w:pPr>
-        <w:jc w:val="both"/>
-      </w:pPr>
-      <w:r>
-        <w:t xml:space="preserve">Ngoài ra, </w:t>
-      </w:r>
-      <w:r>
-        <w:t>phân tích dữ liệu</w:t>
-      </w:r>
-      <w:r>
-        <w:t xml:space="preserve"> còn được ứng dụng trong phát hiện gian lận tài chính. Với số lượng giao dịch tài chính ngày càng lớn, việc phát hiện các hành vi gian lận bằng phương pháp thủ công trở nên khó khăn và kém hiệu quả. Các hệ thống phân tích dữ liệu hiện đại có khả năng theo dõi, phân tích và phát hiện các giao dịch bất thường trong thời gian ngắn thông qua việc sử dụng các thuật toán học máy và phân tích hành vi. Điều này giúp các tổ chức tài chính nâng cao khả năng bảo mật, hạn chế tổn thất và đảm bảo an toàn cho hệ thống giao dịch ngân hàng.</w:t>
-      </w:r>
-    </w:p>
-    <w:p>
-      <w:pPr>
-        <w:jc w:val="both"/>
-      </w:pPr>
-      <w:r>
-        <w:t xml:space="preserve">Nhìn chung, </w:t>
-      </w:r>
-      <w:r>
-        <w:t>phân tích dữ liệu</w:t>
-      </w:r>
-      <w:r>
-        <w:t xml:space="preserve"> đang trở thành một thành phần quan trọng trong quá trình hiện đại hóa ngành tài chính ngân hàng. Việc ứng dụng phân tích dữ liệu không chỉ giúp nâng cao hiệu quả hoạt động mà còn hỗ trợ các tổ chức tài chính xây dựng chiến lược </w:t>
+        <w:t>Trong bối cảnh chuyển đổi số và sự phát triển mạnh mẽ của công nghệ thông tin, dữ liệu đã trở thành một trong những nguồn tài nguyên quan trọng đối với các tổ chức tài chính và ngân hàng. Sự gia tăng nhanh chóng của dữ liệu khách hàng, giao dịch tài chính và hoạt động tín dụng đã thúc đẩy nhu cầu ứng dụng các kỹ thuật phân tích dữ liệu nhằm khai thác thông tin có giá trị phục vụ cho quá trình ra quyết định. Trong lĩnh vực tài chính, phân tích dữ liệu được xem là một công cụ quan trọng giúp các tổ chức tài chính nâng cao hiệu quả vận hành, tối ưu hóa dịch vụ và giảm thiểu rủi ro trong hoạt động kinh doanh.</w:t>
+      </w:r>
+    </w:p>
+    <w:p>
+      <w:pPr>
+        <w:jc w:val="both"/>
+      </w:pPr>
+      <w:r>
+        <w:t>Phân tích dữ liệu là quá trình thu thập, xử lý, phân tích và trực quan hóa dữ liệu nhằm khám phá thông tin, xu hướng và tri thức tiềm ẩn từ dữ liệu. Quá trình này thường kết hợp giữa các phương pháp thống kê, khai phá dữ liệu và học máy để hỗ trợ phân tích và dự đoán. Trong môi trường tài chính hiện đại, dữ liệu không chỉ được sử dụng để lưu trữ thông tin giao dịch mà còn đóng vai trò quan trọng trong việc phân tích hành vi khách hàng, đánh giá khả năng tín dụng và dự báo rủi ro tài chính. Nhờ khả năng xử lý khối lượng dữ liệu lớn với tốc độ cao, phân tích dữ liệu giúp các tổ chức tài chính nâng cao độ chính xác trong việc ra quyết định và cải thiện trải nghiệm khách hàng.</w:t>
+      </w:r>
+    </w:p>
+    <w:p>
+      <w:pPr>
+        <w:jc w:val="both"/>
+      </w:pPr>
+      <w:r>
+        <w:t>Trong lĩnh vực ngân hàng, phân tích dữ liệu được ứng dụng rộng rãi trong nhiều hoạt động khác nhau như quản lý khách hàng, dự báo tài chính, quản trị rủi ro và hỗ trợ xét duyệt tín dụng. Một trong những ứng dụng quan trọng nhất là hệ thống chấm điểm tín dụng, trong đó dữ liệu khách hàng được phân tích để đánh giá khả năng thanh toán và mức độ uy tín tín dụng của người vay. Các yếu tố như thu nhập, lịch sử tín dụng, giá trị tài sản và thời hạn vay thường được sử dụng làm cơ sở để xây dựng mô hình dự đoán khả năng phê duyệt khoản vay. Việc áp dụng phân tích dữ liệu trong chấm điểm tín dụng giúp ngân hàng giảm thiểu sự phụ thuộc vào đánh giá chủ quan của chuyên viên tín dụng, đồng thời nâng cao tính khách quan và hiệu quả trong quá trình xét duyệt khoản vay.</w:t>
+      </w:r>
+    </w:p>
+    <w:p>
+      <w:pPr>
+        <w:jc w:val="both"/>
+      </w:pPr>
+      <w:r>
+        <w:t>Bên cạnh đó, phân tích dữ liệu còn đóng vai trò quan trọng trong hoạt động phân tích rủi ro của ngân hàng. Thông qua việc khai thác dữ liệu lịch sử và mô hình hóa hành vi khách hàng, các tổ chức tài chính có thể nhận diện sớm các khoản vay có nguy cơ mất khả năng thanh toán, từ đó đưa ra các biện pháp kiểm soát phù hợp. Việc ứng dụng các kỹ thuật phân tích dữ liệu giúp ngân hàng tối ưu hóa chiến lược quản trị rủi ro, nâng cao khả năng dự báo và giảm thiểu tổn thất tài chính trong hoạt động tín dụng.</w:t>
+      </w:r>
+    </w:p>
+    <w:p>
+      <w:pPr>
+        <w:jc w:val="both"/>
+      </w:pPr>
+      <w:r>
+        <w:t>Ngoài ra, phân tích dữ liệu còn được ứng dụng trong phát hiện gian lận tài chính. Với số lượng giao dịch tài chính ngày càng lớn, việc phát hiện các hành vi gian lận bằng phương pháp thủ công trở nên khó khăn và kém hiệu quả. Các hệ thống phân tích dữ liệu hiện đại có khả năng theo dõi, phân tích và phát hiện các giao dịch bất thường trong thời gian ngắn thông qua việc sử dụng các thuật toán học máy và phân tích hành vi. Điều này giúp các tổ chức tài chính nâng cao khả năng bảo mật, hạn chế tổn thất và đảm bảo an toàn cho hệ thống giao dịch ngân hàng.</w:t>
+      </w:r>
+    </w:p>
+    <w:p>
+      <w:pPr>
+        <w:jc w:val="both"/>
+      </w:pPr>
+      <w:r>
+        <w:t xml:space="preserve">Nhìn chung, phân tích dữ liệu đang trở thành một thành phần quan trọng trong quá trình hiện đại hóa ngành tài chính ngân hàng. Việc ứng dụng phân tích dữ liệu không chỉ giúp nâng cao hiệu quả hoạt động mà còn hỗ trợ các tổ chức tài chính xây dựng chiến lược </w:t>
       </w:r>
       <w:r>
         <w:lastRenderedPageBreak/>
@@ -673,24 +628,12 @@
         <w:jc w:val="both"/>
       </w:pPr>
       <w:r>
-        <w:t xml:space="preserve">Trong đề tài này, dashboard được xây dựng nhằm hỗ trợ phân tích và trực quan hóa dữ liệu khoản vay. Hệ thống tập trung hiển thị các nội dung như tỷ lệ phê duyệt khoản vay </w:t>
-      </w:r>
-      <w:r>
-        <w:t xml:space="preserve">, </w:t>
-      </w:r>
-      <w:r>
-        <w:t xml:space="preserve">phân phối thu nhập khách hàng, phân tích giá trị khoản </w:t>
-      </w:r>
-      <w:r>
-        <w:t>vay</w:t>
-      </w:r>
-      <w:r>
-        <w:t>, phân tích điểm tín dụng và biểu đồ so sánh giữa các hồ sơ được phê duyệt và từ chối. Các biểu đồ này giúp người dùng dễ dàng đánh giá đặc điểm dữ liệu và hỗ trợ quá trình phân tích tín dụng trong hệ thống dự đoán khoản vay.</w:t>
-      </w:r>
-    </w:p>
-    <w:p>
-      <w:pPr>
-        <w:jc w:val="both"/>
+        <w:t>Trong đề tài này, dashboard được xây dựng nhằm hỗ trợ phân tích và trực quan hóa dữ liệu khoản vay. Hệ thống tập trung hiển thị các nội dung như tỷ lệ phê duyệt khoản vay , phân phối thu nhập khách hàng, phân tích giá trị khoản vay, phân tích điểm tín dụng và biểu đồ so sánh giữa các hồ sơ được phê duyệt và từ chối. Các biểu đồ này giúp người dùng dễ dàng đánh giá đặc điểm dữ liệu và hỗ trợ quá trình phân tích tín dụng trong hệ thống dự đoán khoản vay.</w:t>
+      </w:r>
+    </w:p>
+    <w:p>
+      <w:pPr>
+        <w:pStyle w:val="Heading2"/>
       </w:pPr>
       <w:r>
         <w:t>2.3. Tiền xử lý dữ liệu</w:t>
@@ -701,79 +644,196 @@
         <w:jc w:val="both"/>
       </w:pPr>
       <w:r>
-        <w:t>2.3.1 Missing Values</w:t>
-      </w:r>
-    </w:p>
-    <w:p>
-      <w:pPr>
-        <w:jc w:val="both"/>
-      </w:pPr>
-      <w:r>
-        <w:t>Mean</w:t>
-      </w:r>
-    </w:p>
-    <w:p>
-      <w:pPr>
-        <w:jc w:val="both"/>
-      </w:pPr>
-      <w:r>
-        <w:t>Median</w:t>
-      </w:r>
-    </w:p>
-    <w:p>
-      <w:pPr>
-        <w:jc w:val="both"/>
-      </w:pPr>
-      <w:r>
-        <w:t>Mode</w:t>
-      </w:r>
-    </w:p>
-    <w:p>
-      <w:pPr>
-        <w:jc w:val="both"/>
-      </w:pPr>
-      <w:r>
-        <w:t>2.3.2 Encoding</w:t>
-      </w:r>
-    </w:p>
-    <w:p>
-      <w:pPr>
-        <w:jc w:val="both"/>
-      </w:pPr>
-      <w:r>
-        <w:t>Label Encoding</w:t>
-      </w:r>
-    </w:p>
-    <w:p>
-      <w:pPr>
-        <w:jc w:val="both"/>
-      </w:pPr>
-      <w:r>
-        <w:t>One-Hot Encoding</w:t>
-      </w:r>
-    </w:p>
-    <w:p>
-      <w:pPr>
-        <w:jc w:val="both"/>
-      </w:pPr>
-      <w:r>
-        <w:t>2.3.3 Feature Scaling</w:t>
-      </w:r>
-    </w:p>
-    <w:p>
-      <w:pPr>
-        <w:jc w:val="both"/>
-      </w:pPr>
-      <w:r>
-        <w:t>StandardScaler</w:t>
-      </w:r>
-    </w:p>
-    <w:p>
-      <w:pPr>
-        <w:jc w:val="both"/>
-      </w:pPr>
-      <w:r>
-        <w:t>MinMaxScaler</w:t>
+        <w:t>Tiền xử lý dữ liệu là bước quan trọng trong quá trình phân tích dữ liệu và xây dựng mô hình học máy. Chất lượng dữ liệu đầu vào ảnh hưởng trực tiếp đến độ chính xác và khả năng tổng quát hóa của mô hình dự đoán. Trong bài toán dự đoán phê duyệt khoản vay, dữ liệu khách hàng thường tồn tại các vấn đề như dữ liệu thiếu, dữ liệu ngoại lệ hoặc dữ liệu không đồng nhất. Vì vậy, việc tiền xử lý dữ liệu giúp chuẩn hóa dữ liệu, giảm nhiễu và nâng cao hiệu quả của các mô hình học máy được sử dụng trong hệ thống.</w:t>
+      </w:r>
+    </w:p>
+    <w:p>
+      <w:pPr>
+        <w:pStyle w:val="Heading3"/>
+      </w:pPr>
+      <w:r>
+        <w:t>2.3.1. Missing Values</w:t>
+      </w:r>
+    </w:p>
+    <w:p>
+      <w:pPr>
+        <w:jc w:val="both"/>
+      </w:pPr>
+      <w:r>
+        <w:t>Dữ liệu thiếu là hiện tượng một số thuộc tính trong bộ dữ liệu không có giá trị hoặc bị khuyết. Đây là vấn đề phổ biến trong các bộ dữ liệu tài chính do lỗi nhập liệu, thiếu thông tin khách hàng hoặc quá trình thu thập dữ liệu không đầy đủ. Nếu không được xử lý phù hợp, dữ liệu thiếu có thể làm giảm chất lượng phân tích và ảnh hưởng đến hiệu năng của mô hình dự đoán.</w:t>
+      </w:r>
+    </w:p>
+    <w:p>
+      <w:pPr>
+        <w:jc w:val="both"/>
+      </w:pPr>
+      <w:r>
+        <w:t>Trong quá trình tiền xử lý dữ liệu, đề tài sử dụng các phương pháp thay thế dữ liệu thiếu phổ biến như Mean, Median và Mode nhằm đảm bảo tính đầy đủ của dữ liệu trước khi đưa vào huấn luyện mô hình.</w:t>
+      </w:r>
+    </w:p>
+    <w:p>
+      <w:pPr>
+        <w:pStyle w:val="ListParagraph"/>
+        <w:numPr>
+          <w:ilvl w:val="0"/>
+          <w:numId w:val="6"/>
+        </w:numPr>
+        <w:jc w:val="both"/>
+      </w:pPr>
+      <w:r>
+        <w:t>Mean là phương pháp thay thế giá trị thiếu bằng giá trị trung bình của thuộc tính. Phương pháp này thường được áp dụng cho các biến dữ liệu dạng số có phân phối tương đối đồng đều. Việc sử dụng giá trị trung bình giúp duy trì đặc điểm tổng quát của dữ liệu và giảm ảnh hưởng của dữ liệu bị thiếu trong quá trình phân tích.</w:t>
+      </w:r>
+    </w:p>
+    <w:p>
+      <w:pPr>
+        <w:pStyle w:val="ListParagraph"/>
+        <w:numPr>
+          <w:ilvl w:val="0"/>
+          <w:numId w:val="6"/>
+        </w:numPr>
+        <w:jc w:val="both"/>
+      </w:pPr>
+      <w:r>
+        <w:lastRenderedPageBreak/>
+        <w:t>Median là phương pháp thay thế giá trị thiếu bằng giá trị trung vị của thuộc tính. So với Mean, Median ít bị ảnh hưởng bởi các giá trị ngoại lệ, do đó phù hợp với các thuộc tính tài chính có sự chênh lệch lớn về giá trị như thu nhập hoặc giá trị khoản vay.</w:t>
+      </w:r>
+    </w:p>
+    <w:p>
+      <w:pPr>
+        <w:pStyle w:val="ListParagraph"/>
+        <w:numPr>
+          <w:ilvl w:val="0"/>
+          <w:numId w:val="6"/>
+        </w:numPr>
+        <w:jc w:val="both"/>
+      </w:pPr>
+      <w:r>
+        <w:t>Mode là phương pháp thay thế dữ liệu thiếu bằng giá trị xuất hiện nhiều nhất trong thuộc tính. Phương pháp này thường được áp dụng cho các biến phân loại như trình độ học vấn hoặc trạng thái nghề nghiệp của khách hàng.</w:t>
+      </w:r>
+    </w:p>
+    <w:p>
+      <w:pPr>
+        <w:jc w:val="both"/>
+      </w:pPr>
+      <w:r>
+        <w:t>Trong đề tài này, việc xử lý dữ liệu thiếu giúp đảm bảo bộ dữ liệu khoản vay có tính đầy đủ và ổn định trước khi thực hiện phân tích thống kê và xây dựng các mô hình dự đoán phê duyệt khoản vay. Điều này góp phần nâng cao độ chính xác và hiệu quả của hệ thống dashboard phân tích và học máy được xây dựng.</w:t>
+      </w:r>
+    </w:p>
+    <w:p>
+      <w:pPr>
+        <w:jc w:val="both"/>
+      </w:pPr>
+      <w:r>
+        <w:t>2.3.2. Encoding</w:t>
+      </w:r>
+    </w:p>
+    <w:p>
+      <w:pPr>
+        <w:jc w:val="both"/>
+      </w:pPr>
+      <w:r>
+        <w:t>Trong các bộ dữ liệu tài chính, nhiều thuộc tính được biểu diễn dưới dạng dữ liệu phân loại (Categorical Data) như trình độ học vấn, trạng thái nghề nghiệp hoặc tình trạng tự kinh doanh của khách hàng. Tuy nhiên, các mô hình học máy chỉ có thể xử lý dữ liệu ở dạng số. Vì vậy, quá trình mã hóa dữ liệu được thực hiện nhằm chuyển đổi các giá trị phân loại sang dạng số phù hợp cho quá trình huấn luyện mô hình.</w:t>
+      </w:r>
+    </w:p>
+    <w:p>
+      <w:pPr>
+        <w:jc w:val="both"/>
+      </w:pPr>
+      <w:r>
+        <w:t>Trong đề tài này, hai phương pháp mã hóa phổ biến được sử dụng là Label Encoding và One-Hot Encoding nhằm xử lý các thuộc tính phân loại trong bộ dữ liệu khoản vay.</w:t>
+      </w:r>
+    </w:p>
+    <w:p>
+      <w:pPr>
+        <w:pStyle w:val="ListParagraph"/>
+        <w:numPr>
+          <w:ilvl w:val="0"/>
+          <w:numId w:val="7"/>
+        </w:numPr>
+        <w:jc w:val="both"/>
+      </w:pPr>
+      <w:r>
+        <w:t>Label Encoding là phương pháp chuyển đổi mỗi giá trị phân loại thành một giá trị số nguyên tương ứng. Ví dụ, thuộc tính “Education” có thể được chuyển đổi thành các giá trị như Graduate = 1 và Not Graduate = 0. Phương pháp này có ưu điểm đơn giản, tiết kiệm bộ nhớ và phù hợp với các thuộc tính có số lượng giá trị phân loại nhỏ. Trong đề tài, Label Encoding được sử dụng cho các biến có tính chất nhị phân nhằm hỗ trợ quá trình huấn luyện mô hình học máy.</w:t>
+      </w:r>
+    </w:p>
+    <w:p>
+      <w:pPr>
+        <w:pStyle w:val="ListParagraph"/>
+        <w:numPr>
+          <w:ilvl w:val="0"/>
+          <w:numId w:val="7"/>
+        </w:numPr>
+        <w:jc w:val="both"/>
+      </w:pPr>
+      <w:r>
+        <w:t>One-Hot Encoding là phương pháp tạo ra các cột nhị phân mới cho từng giá trị phân loại trong thuộc tính. Mỗi giá trị sẽ được biểu diễn bằng một vector gồm các giá trị 0 và 1. Phương pháp này giúp tránh việc mô hình hiểu sai mối quan hệ thứ tự giữa các giá trị phân loại, từ đó nâng cao khả năng biểu diễn dữ liệu cho các thuật toán học máy. One-Hot Encoding thường được áp dụng cho các thuộc tính có nhiều nhóm giá trị khác nhau và không mang ý nghĩa thứ tự.</w:t>
+      </w:r>
+    </w:p>
+    <w:p>
+      <w:pPr>
+        <w:jc w:val="both"/>
+      </w:pPr>
+      <w:r>
+        <w:t>Trong bài toán dự đoán phê duyệt khoản vay, quá trình Encoding giúp chuẩn hóa dữ liệu đầu vào và đảm bảo tính tương thích với các mô hình học máy như Logistic Regression, Decision Tree và Random Forest. Việc lựa chọn phương pháp mã hóa phù hợp góp phần cải thiện hiệu năng mô hình và nâng cao độ chính xác trong quá trình dự đoán trạng thái khoản vay.</w:t>
+      </w:r>
+    </w:p>
+    <w:p>
+      <w:pPr>
+        <w:jc w:val="both"/>
+      </w:pPr>
+      <w:r>
+        <w:t>2.3.3. Feature Scaling</w:t>
+      </w:r>
+    </w:p>
+    <w:p>
+      <w:pPr>
+        <w:jc w:val="both"/>
+      </w:pPr>
+      <w:r>
+        <w:t>Trong quá trình xây dựng mô hình học máy, các thuộc tính trong bộ dữ liệu thường có sự khác biệt lớn về đơn vị và phạm vi giá trị. Ví dụ, thuộc tính thu nhập khách hàng có thể có giá trị hàng triệu, trong khi điểm tín dụng chỉ nằm trong một khoảng nhỏ. Sự chênh lệch này có thể ảnh hưởng đến khả năng học của mô hình và làm giảm hiệu quả dự đoán. Vì vậy, quá trình chuẩn hóa dữ liệu (Feature Scaling) được sử dụng nhằm đưa các thuộc tính về cùng phạm vi giá trị, từ đó giúp mô hình học máy hoạt động ổn định và hiệu quả hơn.</w:t>
+      </w:r>
+    </w:p>
+    <w:p>
+      <w:pPr>
+        <w:jc w:val="both"/>
+      </w:pPr>
+      <w:r>
+        <w:lastRenderedPageBreak/>
+        <w:t>Trong đề tài này, hai phương pháp chuẩn hóa dữ liệu phổ biến được sử dụng là StandardScaler và MinMaxScaler nhằm hỗ trợ quá trình huấn luyện các mô hình học máy trên bộ dữ liệu khoản vay.</w:t>
+      </w:r>
+    </w:p>
+    <w:p>
+      <w:pPr>
+        <w:pStyle w:val="ListParagraph"/>
+        <w:numPr>
+          <w:ilvl w:val="0"/>
+          <w:numId w:val="8"/>
+        </w:numPr>
+        <w:jc w:val="both"/>
+      </w:pPr>
+      <w:r>
+        <w:t>StandrdScaler là phương pháp chuẩn hóa dữ liệu dựa trên giá trị trung bình và độ lệch chuẩn của thuộc tính. Sau khi chuẩn hóa, dữ liệu sẽ có giá trị trung bình bằng 0 và độ lệch chuẩn bằng 1. Phương pháp này giúp giảm ảnh hưởng của sự khác biệt về đơn vị đo lường giữa các thuộc tính và thường được áp dụng cho các mô hình nhạy cảm với phạm vi dữ liệu như Logistic Regression. StandardScaler phù hợp với các thuộc tính có phân phối gần chuẩn và giúp cải thiện tốc độ hội tụ của mô hình trong quá trình huấn luyện.</w:t>
+      </w:r>
+    </w:p>
+    <w:p>
+      <w:pPr>
+        <w:pStyle w:val="ListParagraph"/>
+        <w:numPr>
+          <w:ilvl w:val="0"/>
+          <w:numId w:val="8"/>
+        </w:numPr>
+        <w:jc w:val="both"/>
+      </w:pPr>
+      <w:r>
+        <w:t>MinMaxScaler là phương pháp đưa dữ liệu về một khoảng giá trị xác định, thường là từ 0 đến 1. Phương pháp này được thực hiện bằng cách sử dụng giá trị nhỏ nhất và lớn nhất của thuộc tính để chuẩn hóa dữ liệu. MinMaxScaler giúp giữ nguyên phân phối ban đầu của dữ liệu và phù hợp với các bài toán cần giới hạn phạm vi giá trị đầu vào. Tuy nhiên, phương pháp này có thể bị ảnh hưởng bởi các giá trị ngoại lệ trong dữ liệu.</w:t>
+      </w:r>
+    </w:p>
+    <w:p>
+      <w:pPr>
+        <w:jc w:val="both"/>
+      </w:pPr>
+      <w:r>
+        <w:t>Trong bài toán dự đoán phê duyệt khoản vay, việc áp dụng Feature Scaling giúp các mô hình học máy xử lý dữ liệu hiệu quả hơn và nâng cao khả năng dự đoán. Đặc biệt, các mô hình như Logistic Regression thường yêu cầu dữ liệu được chuẩn hóa để đạt hiệu năng tốt hơn. Trong khi đó, các mô hình dạng cây như Decision Tree và Random Forest ít bị ảnh hưởng bởi phạm vi dữ liệu nên không bắt buộc phải thực hiện chuẩn hóa. Việc lựa chọn phương pháp chuẩn hóa phù hợp góp phần cải thiện độ chính xác và tính ổn định của hệ thống dự đoán khoản vay trong đề tài.</w:t>
       </w:r>
     </w:p>
     <w:p>
@@ -796,6 +856,11 @@
       <w:pPr>
         <w:jc w:val="both"/>
       </w:pPr>
+    </w:p>
+    <w:p>
+      <w:pPr>
+        <w:jc w:val="both"/>
+      </w:pPr>
       <w:r>
         <w:t>Z-score</w:t>
       </w:r>
@@ -813,7 +878,6 @@
         <w:jc w:val="both"/>
       </w:pPr>
       <w:r>
-        <w:lastRenderedPageBreak/>
         <w:t>2.5. Chi-square Test</w:t>
       </w:r>
     </w:p>
@@ -1094,10 +1158,7 @@
       </w:pPr>
       <w:r>
         <w:lastRenderedPageBreak/>
-        <w:t xml:space="preserve">CHƯƠNG 4. </w:t>
-      </w:r>
-      <w:r>
-        <w:t>DASHBOARD VÀ KẾT QUẢ THỰC NGHIỆM</w:t>
+        <w:t>CHƯƠNG 4. DASHBOARD VÀ KẾT QUẢ THỰC NGHIỆM</w:t>
       </w:r>
     </w:p>
     <w:p>
@@ -1423,6 +1484,232 @@
 <file path=word/numbering.xml><?xml version="1.0" encoding="utf-8"?>
 <w:numbering xmlns:wpc="http://schemas.microsoft.com/office/word/2010/wordprocessingCanvas" xmlns:cx="http://schemas.microsoft.com/office/drawing/2014/chartex" xmlns:cx1="http://schemas.microsoft.com/office/drawing/2015/9/8/chartex" xmlns:cx2="http://schemas.microsoft.com/office/drawing/2015/10/21/chartex" xmlns:cx3="http://schemas.microsoft.com/office/drawing/2016/5/9/chartex" xmlns:cx4="http://schemas.microsoft.com/office/drawing/2016/5/10/chartex" xmlns:cx5="http://schemas.microsoft.com/office/drawing/2016/5/11/chartex" xmlns:cx6="http://schemas.microsoft.com/office/drawing/2016/5/12/chartex" xmlns:cx7="http://schemas.microsoft.com/office/drawing/2016/5/13/chartex" xmlns:cx8="http://schemas.microsoft.com/office/drawing/2016/5/14/chartex" xmlns:mc="http://schemas.openxmlformats.org/markup-compatibility/2006" xmlns:aink="http://schemas.microsoft.com/office/drawing/2016/ink" xmlns:am3d="http://schemas.microsoft.com/office/drawing/2017/model3d" xmlns:o="urn:schemas-microsoft-com:office:office" xmlns:oel="http://schemas.microsoft.com/office/2019/extlst" xmlns:r="http://schemas.openxmlformats.org/officeDocument/2006/relationships" xmlns:m="http://schemas.openxmlformats.org/officeDocument/2006/math" xmlns:v="urn:schemas-microsoft-com:vml" xmlns:wp14="http://schemas.microsoft.com/office/word/2010/wordprocessingDrawing" xmlns:wp="http://schemas.openxmlformats.org/drawingml/2006/wordprocessingDrawing" xmlns:w10="urn:schemas-microsoft-com:office:word" xmlns:w="http://schemas.openxmlformats.org/wordprocessingml/2006/main" xmlns:w14="http://schemas.microsoft.com/office/word/2010/wordml" xmlns:w15="http://schemas.microsoft.com/office/word/2012/wordml" xmlns:w16cex="http://schemas.microsoft.com/office/word/2018/wordml/cex" xmlns:w16cid="http://schemas.microsoft.com/office/word/2016/wordml/cid" xmlns:w16="http://schemas.microsoft.com/office/word/2018/wordml" xmlns:w16du="http://schemas.microsoft.com/office/word/2023/wordml/word16du" xmlns:w16sdtdh="http://schemas.microsoft.com/office/word/2020/wordml/sdtdatahash" xmlns:w16sdtfl="http://schemas.microsoft.com/office/word/2024/wordml/sdtformatlock" xmlns:w16se="http://schemas.microsoft.com/office/word/2015/wordml/symex" xmlns:wpg="http://schemas.microsoft.com/office/word/2010/wordprocessingGroup" xmlns:wpi="http://schemas.microsoft.com/office/word/2010/wordprocessingInk" xmlns:wne="http://schemas.microsoft.com/office/word/2006/wordml" xmlns:wps="http://schemas.microsoft.com/office/word/2010/wordprocessingShape" mc:Ignorable="w14 w15 w16se w16cid w16 w16cex w16sdtdh w16sdtfl w16du wp14">
   <w:abstractNum w:abstractNumId="0" w15:restartNumberingAfterBreak="0">
+    <w:nsid w:val="27E708D7"/>
+    <w:multiLevelType w:val="hybridMultilevel"/>
+    <w:tmpl w:val="B164B81E"/>
+    <w:lvl w:ilvl="0" w:tplc="04090001">
+      <w:start w:val="1"/>
+      <w:numFmt w:val="bullet"/>
+      <w:lvlText w:val=""/>
+      <w:lvlJc w:val="left"/>
+      <w:pPr>
+        <w:ind w:left="720" w:hanging="360"/>
+      </w:pPr>
+      <w:rPr>
+        <w:rFonts w:ascii="Symbol" w:hAnsi="Symbol" w:hint="default"/>
+      </w:rPr>
+    </w:lvl>
+    <w:lvl w:ilvl="1" w:tplc="04090003" w:tentative="1">
+      <w:start w:val="1"/>
+      <w:numFmt w:val="bullet"/>
+      <w:lvlText w:val="o"/>
+      <w:lvlJc w:val="left"/>
+      <w:pPr>
+        <w:ind w:left="1440" w:hanging="360"/>
+      </w:pPr>
+      <w:rPr>
+        <w:rFonts w:ascii="Courier New" w:hAnsi="Courier New" w:cs="Courier New" w:hint="default"/>
+      </w:rPr>
+    </w:lvl>
+    <w:lvl w:ilvl="2" w:tplc="04090005" w:tentative="1">
+      <w:start w:val="1"/>
+      <w:numFmt w:val="bullet"/>
+      <w:lvlText w:val=""/>
+      <w:lvlJc w:val="left"/>
+      <w:pPr>
+        <w:ind w:left="2160" w:hanging="360"/>
+      </w:pPr>
+      <w:rPr>
+        <w:rFonts w:ascii="Wingdings" w:hAnsi="Wingdings" w:hint="default"/>
+      </w:rPr>
+    </w:lvl>
+    <w:lvl w:ilvl="3" w:tplc="04090001" w:tentative="1">
+      <w:start w:val="1"/>
+      <w:numFmt w:val="bullet"/>
+      <w:lvlText w:val=""/>
+      <w:lvlJc w:val="left"/>
+      <w:pPr>
+        <w:ind w:left="2880" w:hanging="360"/>
+      </w:pPr>
+      <w:rPr>
+        <w:rFonts w:ascii="Symbol" w:hAnsi="Symbol" w:hint="default"/>
+      </w:rPr>
+    </w:lvl>
+    <w:lvl w:ilvl="4" w:tplc="04090003" w:tentative="1">
+      <w:start w:val="1"/>
+      <w:numFmt w:val="bullet"/>
+      <w:lvlText w:val="o"/>
+      <w:lvlJc w:val="left"/>
+      <w:pPr>
+        <w:ind w:left="3600" w:hanging="360"/>
+      </w:pPr>
+      <w:rPr>
+        <w:rFonts w:ascii="Courier New" w:hAnsi="Courier New" w:cs="Courier New" w:hint="default"/>
+      </w:rPr>
+    </w:lvl>
+    <w:lvl w:ilvl="5" w:tplc="04090005" w:tentative="1">
+      <w:start w:val="1"/>
+      <w:numFmt w:val="bullet"/>
+      <w:lvlText w:val=""/>
+      <w:lvlJc w:val="left"/>
+      <w:pPr>
+        <w:ind w:left="4320" w:hanging="360"/>
+      </w:pPr>
+      <w:rPr>
+        <w:rFonts w:ascii="Wingdings" w:hAnsi="Wingdings" w:hint="default"/>
+      </w:rPr>
+    </w:lvl>
+    <w:lvl w:ilvl="6" w:tplc="04090001" w:tentative="1">
+      <w:start w:val="1"/>
+      <w:numFmt w:val="bullet"/>
+      <w:lvlText w:val=""/>
+      <w:lvlJc w:val="left"/>
+      <w:pPr>
+        <w:ind w:left="5040" w:hanging="360"/>
+      </w:pPr>
+      <w:rPr>
+        <w:rFonts w:ascii="Symbol" w:hAnsi="Symbol" w:hint="default"/>
+      </w:rPr>
+    </w:lvl>
+    <w:lvl w:ilvl="7" w:tplc="04090003" w:tentative="1">
+      <w:start w:val="1"/>
+      <w:numFmt w:val="bullet"/>
+      <w:lvlText w:val="o"/>
+      <w:lvlJc w:val="left"/>
+      <w:pPr>
+        <w:ind w:left="5760" w:hanging="360"/>
+      </w:pPr>
+      <w:rPr>
+        <w:rFonts w:ascii="Courier New" w:hAnsi="Courier New" w:cs="Courier New" w:hint="default"/>
+      </w:rPr>
+    </w:lvl>
+    <w:lvl w:ilvl="8" w:tplc="04090005" w:tentative="1">
+      <w:start w:val="1"/>
+      <w:numFmt w:val="bullet"/>
+      <w:lvlText w:val=""/>
+      <w:lvlJc w:val="left"/>
+      <w:pPr>
+        <w:ind w:left="6480" w:hanging="360"/>
+      </w:pPr>
+      <w:rPr>
+        <w:rFonts w:ascii="Wingdings" w:hAnsi="Wingdings" w:hint="default"/>
+      </w:rPr>
+    </w:lvl>
+  </w:abstractNum>
+  <w:abstractNum w:abstractNumId="1" w15:restartNumberingAfterBreak="0">
+    <w:nsid w:val="35C743D8"/>
+    <w:multiLevelType w:val="hybridMultilevel"/>
+    <w:tmpl w:val="E0AE0D44"/>
+    <w:lvl w:ilvl="0" w:tplc="04090001">
+      <w:start w:val="1"/>
+      <w:numFmt w:val="bullet"/>
+      <w:lvlText w:val=""/>
+      <w:lvlJc w:val="left"/>
+      <w:pPr>
+        <w:ind w:left="720" w:hanging="360"/>
+      </w:pPr>
+      <w:rPr>
+        <w:rFonts w:ascii="Symbol" w:hAnsi="Symbol" w:hint="default"/>
+      </w:rPr>
+    </w:lvl>
+    <w:lvl w:ilvl="1" w:tplc="04090003" w:tentative="1">
+      <w:start w:val="1"/>
+      <w:numFmt w:val="bullet"/>
+      <w:lvlText w:val="o"/>
+      <w:lvlJc w:val="left"/>
+      <w:pPr>
+        <w:ind w:left="1440" w:hanging="360"/>
+      </w:pPr>
+      <w:rPr>
+        <w:rFonts w:ascii="Courier New" w:hAnsi="Courier New" w:cs="Courier New" w:hint="default"/>
+      </w:rPr>
+    </w:lvl>
+    <w:lvl w:ilvl="2" w:tplc="04090005" w:tentative="1">
+      <w:start w:val="1"/>
+      <w:numFmt w:val="bullet"/>
+      <w:lvlText w:val=""/>
+      <w:lvlJc w:val="left"/>
+      <w:pPr>
+        <w:ind w:left="2160" w:hanging="360"/>
+      </w:pPr>
+      <w:rPr>
+        <w:rFonts w:ascii="Wingdings" w:hAnsi="Wingdings" w:hint="default"/>
+      </w:rPr>
+    </w:lvl>
+    <w:lvl w:ilvl="3" w:tplc="04090001" w:tentative="1">
+      <w:start w:val="1"/>
+      <w:numFmt w:val="bullet"/>
+      <w:lvlText w:val=""/>
+      <w:lvlJc w:val="left"/>
+      <w:pPr>
+        <w:ind w:left="2880" w:hanging="360"/>
+      </w:pPr>
+      <w:rPr>
+        <w:rFonts w:ascii="Symbol" w:hAnsi="Symbol" w:hint="default"/>
+      </w:rPr>
+    </w:lvl>
+    <w:lvl w:ilvl="4" w:tplc="04090003" w:tentative="1">
+      <w:start w:val="1"/>
+      <w:numFmt w:val="bullet"/>
+      <w:lvlText w:val="o"/>
+      <w:lvlJc w:val="left"/>
+      <w:pPr>
+        <w:ind w:left="3600" w:hanging="360"/>
+      </w:pPr>
+      <w:rPr>
+        <w:rFonts w:ascii="Courier New" w:hAnsi="Courier New" w:cs="Courier New" w:hint="default"/>
+      </w:rPr>
+    </w:lvl>
+    <w:lvl w:ilvl="5" w:tplc="04090005" w:tentative="1">
+      <w:start w:val="1"/>
+      <w:numFmt w:val="bullet"/>
+      <w:lvlText w:val=""/>
+      <w:lvlJc w:val="left"/>
+      <w:pPr>
+        <w:ind w:left="4320" w:hanging="360"/>
+      </w:pPr>
+      <w:rPr>
+        <w:rFonts w:ascii="Wingdings" w:hAnsi="Wingdings" w:hint="default"/>
+      </w:rPr>
+    </w:lvl>
+    <w:lvl w:ilvl="6" w:tplc="04090001" w:tentative="1">
+      <w:start w:val="1"/>
+      <w:numFmt w:val="bullet"/>
+      <w:lvlText w:val=""/>
+      <w:lvlJc w:val="left"/>
+      <w:pPr>
+        <w:ind w:left="5040" w:hanging="360"/>
+      </w:pPr>
+      <w:rPr>
+        <w:rFonts w:ascii="Symbol" w:hAnsi="Symbol" w:hint="default"/>
+      </w:rPr>
+    </w:lvl>
+    <w:lvl w:ilvl="7" w:tplc="04090003" w:tentative="1">
+      <w:start w:val="1"/>
+      <w:numFmt w:val="bullet"/>
+      <w:lvlText w:val="o"/>
+      <w:lvlJc w:val="left"/>
+      <w:pPr>
+        <w:ind w:left="5760" w:hanging="360"/>
+      </w:pPr>
+      <w:rPr>
+        <w:rFonts w:ascii="Courier New" w:hAnsi="Courier New" w:cs="Courier New" w:hint="default"/>
+      </w:rPr>
+    </w:lvl>
+    <w:lvl w:ilvl="8" w:tplc="04090005" w:tentative="1">
+      <w:start w:val="1"/>
+      <w:numFmt w:val="bullet"/>
+      <w:lvlText w:val=""/>
+      <w:lvlJc w:val="left"/>
+      <w:pPr>
+        <w:ind w:left="6480" w:hanging="360"/>
+      </w:pPr>
+      <w:rPr>
+        <w:rFonts w:ascii="Wingdings" w:hAnsi="Wingdings" w:hint="default"/>
+      </w:rPr>
+    </w:lvl>
+  </w:abstractNum>
+  <w:abstractNum w:abstractNumId="2" w15:restartNumberingAfterBreak="0">
     <w:nsid w:val="571F17CE"/>
     <w:multiLevelType w:val="multilevel"/>
     <w:tmpl w:val="DC041914"/>
@@ -1571,7 +1858,7 @@
       </w:rPr>
     </w:lvl>
   </w:abstractNum>
-  <w:abstractNum w:abstractNumId="1" w15:restartNumberingAfterBreak="0">
+  <w:abstractNum w:abstractNumId="3" w15:restartNumberingAfterBreak="0">
     <w:nsid w:val="5C3538A1"/>
     <w:multiLevelType w:val="hybridMultilevel"/>
     <w:tmpl w:val="8778AE32"/>
@@ -1684,7 +1971,120 @@
       </w:rPr>
     </w:lvl>
   </w:abstractNum>
-  <w:abstractNum w:abstractNumId="2" w15:restartNumberingAfterBreak="0">
+  <w:abstractNum w:abstractNumId="4" w15:restartNumberingAfterBreak="0">
+    <w:nsid w:val="609906E7"/>
+    <w:multiLevelType w:val="hybridMultilevel"/>
+    <w:tmpl w:val="0E448A76"/>
+    <w:lvl w:ilvl="0" w:tplc="04090001">
+      <w:start w:val="1"/>
+      <w:numFmt w:val="bullet"/>
+      <w:lvlText w:val=""/>
+      <w:lvlJc w:val="left"/>
+      <w:pPr>
+        <w:ind w:left="720" w:hanging="360"/>
+      </w:pPr>
+      <w:rPr>
+        <w:rFonts w:ascii="Symbol" w:hAnsi="Symbol" w:hint="default"/>
+      </w:rPr>
+    </w:lvl>
+    <w:lvl w:ilvl="1" w:tplc="04090003" w:tentative="1">
+      <w:start w:val="1"/>
+      <w:numFmt w:val="bullet"/>
+      <w:lvlText w:val="o"/>
+      <w:lvlJc w:val="left"/>
+      <w:pPr>
+        <w:ind w:left="1440" w:hanging="360"/>
+      </w:pPr>
+      <w:rPr>
+        <w:rFonts w:ascii="Courier New" w:hAnsi="Courier New" w:cs="Courier New" w:hint="default"/>
+      </w:rPr>
+    </w:lvl>
+    <w:lvl w:ilvl="2" w:tplc="04090005" w:tentative="1">
+      <w:start w:val="1"/>
+      <w:numFmt w:val="bullet"/>
+      <w:lvlText w:val=""/>
+      <w:lvlJc w:val="left"/>
+      <w:pPr>
+        <w:ind w:left="2160" w:hanging="360"/>
+      </w:pPr>
+      <w:rPr>
+        <w:rFonts w:ascii="Wingdings" w:hAnsi="Wingdings" w:hint="default"/>
+      </w:rPr>
+    </w:lvl>
+    <w:lvl w:ilvl="3" w:tplc="04090001" w:tentative="1">
+      <w:start w:val="1"/>
+      <w:numFmt w:val="bullet"/>
+      <w:lvlText w:val=""/>
+      <w:lvlJc w:val="left"/>
+      <w:pPr>
+        <w:ind w:left="2880" w:hanging="360"/>
+      </w:pPr>
+      <w:rPr>
+        <w:rFonts w:ascii="Symbol" w:hAnsi="Symbol" w:hint="default"/>
+      </w:rPr>
+    </w:lvl>
+    <w:lvl w:ilvl="4" w:tplc="04090003" w:tentative="1">
+      <w:start w:val="1"/>
+      <w:numFmt w:val="bullet"/>
+      <w:lvlText w:val="o"/>
+      <w:lvlJc w:val="left"/>
+      <w:pPr>
+        <w:ind w:left="3600" w:hanging="360"/>
+      </w:pPr>
+      <w:rPr>
+        <w:rFonts w:ascii="Courier New" w:hAnsi="Courier New" w:cs="Courier New" w:hint="default"/>
+      </w:rPr>
+    </w:lvl>
+    <w:lvl w:ilvl="5" w:tplc="04090005" w:tentative="1">
+      <w:start w:val="1"/>
+      <w:numFmt w:val="bullet"/>
+      <w:lvlText w:val=""/>
+      <w:lvlJc w:val="left"/>
+      <w:pPr>
+        <w:ind w:left="4320" w:hanging="360"/>
+      </w:pPr>
+      <w:rPr>
+        <w:rFonts w:ascii="Wingdings" w:hAnsi="Wingdings" w:hint="default"/>
+      </w:rPr>
+    </w:lvl>
+    <w:lvl w:ilvl="6" w:tplc="04090001" w:tentative="1">
+      <w:start w:val="1"/>
+      <w:numFmt w:val="bullet"/>
+      <w:lvlText w:val=""/>
+      <w:lvlJc w:val="left"/>
+      <w:pPr>
+        <w:ind w:left="5040" w:hanging="360"/>
+      </w:pPr>
+      <w:rPr>
+        <w:rFonts w:ascii="Symbol" w:hAnsi="Symbol" w:hint="default"/>
+      </w:rPr>
+    </w:lvl>
+    <w:lvl w:ilvl="7" w:tplc="04090003" w:tentative="1">
+      <w:start w:val="1"/>
+      <w:numFmt w:val="bullet"/>
+      <w:lvlText w:val="o"/>
+      <w:lvlJc w:val="left"/>
+      <w:pPr>
+        <w:ind w:left="5760" w:hanging="360"/>
+      </w:pPr>
+      <w:rPr>
+        <w:rFonts w:ascii="Courier New" w:hAnsi="Courier New" w:cs="Courier New" w:hint="default"/>
+      </w:rPr>
+    </w:lvl>
+    <w:lvl w:ilvl="8" w:tplc="04090005" w:tentative="1">
+      <w:start w:val="1"/>
+      <w:numFmt w:val="bullet"/>
+      <w:lvlText w:val=""/>
+      <w:lvlJc w:val="left"/>
+      <w:pPr>
+        <w:ind w:left="6480" w:hanging="360"/>
+      </w:pPr>
+      <w:rPr>
+        <w:rFonts w:ascii="Wingdings" w:hAnsi="Wingdings" w:hint="default"/>
+      </w:rPr>
+    </w:lvl>
+  </w:abstractNum>
+  <w:abstractNum w:abstractNumId="5" w15:restartNumberingAfterBreak="0">
     <w:nsid w:val="67003BC6"/>
     <w:multiLevelType w:val="multilevel"/>
     <w:tmpl w:val="A8868D3A"/>
@@ -1833,7 +2233,7 @@
       </w:rPr>
     </w:lvl>
   </w:abstractNum>
-  <w:abstractNum w:abstractNumId="3" w15:restartNumberingAfterBreak="0">
+  <w:abstractNum w:abstractNumId="6" w15:restartNumberingAfterBreak="0">
     <w:nsid w:val="68944AF9"/>
     <w:multiLevelType w:val="multilevel"/>
     <w:tmpl w:val="C8F28888"/>
@@ -1982,7 +2382,7 @@
       </w:rPr>
     </w:lvl>
   </w:abstractNum>
-  <w:abstractNum w:abstractNumId="4" w15:restartNumberingAfterBreak="0">
+  <w:abstractNum w:abstractNumId="7" w15:restartNumberingAfterBreak="0">
     <w:nsid w:val="779A19FA"/>
     <w:multiLevelType w:val="multilevel"/>
     <w:tmpl w:val="7318E25A"/>
@@ -2132,19 +2532,28 @@
     </w:lvl>
   </w:abstractNum>
   <w:num w:numId="1" w16cid:durableId="476337399">
-    <w:abstractNumId w:val="4"/>
+    <w:abstractNumId w:val="7"/>
   </w:num>
   <w:num w:numId="2" w16cid:durableId="1111701733">
+    <w:abstractNumId w:val="2"/>
+  </w:num>
+  <w:num w:numId="3" w16cid:durableId="676813739">
+    <w:abstractNumId w:val="5"/>
+  </w:num>
+  <w:num w:numId="4" w16cid:durableId="433600237">
+    <w:abstractNumId w:val="6"/>
+  </w:num>
+  <w:num w:numId="5" w16cid:durableId="1421180368">
+    <w:abstractNumId w:val="3"/>
+  </w:num>
+  <w:num w:numId="6" w16cid:durableId="231701857">
+    <w:abstractNumId w:val="1"/>
+  </w:num>
+  <w:num w:numId="7" w16cid:durableId="674962010">
     <w:abstractNumId w:val="0"/>
   </w:num>
-  <w:num w:numId="3" w16cid:durableId="676813739">
-    <w:abstractNumId w:val="2"/>
-  </w:num>
-  <w:num w:numId="4" w16cid:durableId="433600237">
-    <w:abstractNumId w:val="3"/>
-  </w:num>
-  <w:num w:numId="5" w16cid:durableId="1421180368">
-    <w:abstractNumId w:val="1"/>
+  <w:num w:numId="8" w16cid:durableId="411392915">
+    <w:abstractNumId w:val="4"/>
   </w:num>
 </w:numbering>
 </file>

</xml_diff>

<commit_message>
docs: enhance README.md with detailed analysis, model evaluation, and GitHub profile standards
</commit_message>
<xml_diff>
--- a/reports/bao_cao.docx
+++ b/reports/bao_cao.docx
@@ -947,7 +947,7 @@
     </w:p>
     <w:p>
       <w:pPr>
-        <w:jc w:val="both"/>
+        <w:pStyle w:val="Heading2"/>
       </w:pPr>
       <w:r>
         <w:t>3.1. Mô tả dữ liệu</w:t>
@@ -958,6 +958,43 @@
         <w:jc w:val="both"/>
       </w:pPr>
       <w:r>
+        <w:t>Trong nghiên cứu nhóm sử dụng bộ dữ liệu Loan Approval Prediction Dataset nhằm phục vụ cho bài toán phân loại trạng thái phê duyệt khoản vay của khách hàng. Bộ dữ liệu được xây dựng dựa trên các yếu tố thường được các tổ chức tài chính và ngân hàng sử dụng trong quá trình đánh giá hồ sơ tín dụng như thông tin nhân khẩu học, thu nhập, điểm tín dụng và giá trị tài sản thế chấp.</w:t>
+      </w:r>
+    </w:p>
+    <w:p>
+      <w:pPr>
+        <w:jc w:val="both"/>
+      </w:pPr>
+      <w:r>
+        <w:t>Bộ dữ liệu bao gồm 4.269 bản ghi với 13 thuộc tính, trong đó có 12 biến đầu vào và 1 biến mục tiêu. Mỗi bản ghi đại diện cho một hồ sơ vay vốn của khách hàng tại ngân hàng hoặc tổ chức tín dụng.</w:t>
+      </w:r>
+    </w:p>
+    <w:p>
+      <w:pPr>
+        <w:jc w:val="both"/>
+      </w:pPr>
+      <w:r>
+        <w:t>Biến mục tiêu của bài toán là loan_status, biểu thị trạng thái khoản vay được phê duyệt  hoặc bị từ chối. Đây là bài toán phân loại nhị phân trong lĩnh vực học máy, với mục tiêu xây dựng mô hình có khả năng dự đoán kết quả phê duyệt khoản vay dựa trên các đặc trưng tài chính và tín dụng của khách hàng.</w:t>
+      </w:r>
+    </w:p>
+    <w:p>
+      <w:pPr>
+        <w:jc w:val="both"/>
+      </w:pPr>
+      <w:r>
+        <w:t>Các thuộc tính trong tập dữ liệu được chia thành ba nhóm chính gồm: nhóm thông tin nhân khẩu học, nhóm năng lực tài chính và nhóm tài sản đảm bảo. Việc phân chia này giúp thuận lợi cho quá trình phân tích dữ liệu cũng như đánh giá mức độ ảnh hưởng của từng nhóm biến đối với quyết định phê duyệt khoản vay.</w:t>
+      </w:r>
+    </w:p>
+    <w:p>
+      <w:pPr>
+        <w:jc w:val="both"/>
+      </w:pPr>
+    </w:p>
+    <w:p>
+      <w:pPr>
+        <w:jc w:val="both"/>
+      </w:pPr>
+      <w:r>
         <w:t>3.2. Tiền xử lý dữ liệu</w:t>
       </w:r>
     </w:p>
@@ -1098,6 +1135,7 @@
         <w:jc w:val="both"/>
       </w:pPr>
       <w:r>
+        <w:lastRenderedPageBreak/>
         <w:t>F1-score</w:t>
       </w:r>
     </w:p>

</xml_diff>